<commit_message>
Keep Yingxi as a product-only demo and refresh the intern resume.
Drop the in-app resume route, add GitHub and Vercel links, set a January 2026 start, and remove the lost airline coursework project.

Co-authored-by: entice0328 <entice0328@gmail.com>
</commit_message>
<xml_diff>
--- a/resume/张力元-数据分析实习生.docx
+++ b/resume/张力元-数据分析实习生.docx
@@ -4,8 +4,7 @@
   <w:body>
     <w:p>
       <w:pPr>
-        <w:spacing w:after="40"/>
-        <w:jc w:val="left"/>
+        <w:spacing w:after="40" w:before="0" w:line="269" w:lineRule="auto"/>
       </w:pPr>
       <w:r>
         <w:rPr>
@@ -18,34 +17,60 @@
     </w:p>
     <w:p>
       <w:pPr>
-        <w:spacing w:after="40"/>
+        <w:spacing w:after="40" w:before="0" w:line="269" w:lineRule="auto"/>
       </w:pPr>
       <w:r>
         <w:rPr>
           <w:rFonts w:ascii="Calibri" w:hAnsi="Calibri" w:eastAsia="宋体"/>
           <w:b w:val="0"/>
-          <w:color w:val="464646"/>
-          <w:sz w:val="21"/>
+          <w:color w:val="505050"/>
+          <w:sz w:val="22"/>
         </w:rPr>
         <w:t>数据分析实习生  |  数据运营 / 商业分析 / BI  |  求职城市：武汉</w:t>
       </w:r>
     </w:p>
     <w:p>
       <w:pPr>
-        <w:spacing w:after="120"/>
+        <w:spacing w:after="20" w:before="0" w:line="269" w:lineRule="auto"/>
       </w:pPr>
       <w:r>
         <w:rPr>
           <w:rFonts w:ascii="Calibri" w:hAnsi="Calibri" w:eastAsia="宋体"/>
           <w:b w:val="0"/>
-          <w:sz w:val="21"/>
+          <w:sz w:val="22"/>
         </w:rPr>
-        <w:t>15752886130    entice0328@gmail.com    作品：营析经营分析台（本仓库）</w:t>
+        <w:t>15752886130    entice0328@gmail.com</w:t>
       </w:r>
     </w:p>
     <w:p>
       <w:pPr>
-        <w:spacing w:before="200" w:after="80"/>
+        <w:spacing w:after="0" w:before="0" w:line="269" w:lineRule="auto"/>
+      </w:pPr>
+      <w:r>
+        <w:rPr>
+          <w:rFonts w:ascii="Calibri" w:hAnsi="Calibri" w:eastAsia="宋体"/>
+          <w:b w:val="0"/>
+          <w:sz w:val="22"/>
+        </w:rPr>
+        <w:t>演示  https://yingxi-analytics.vercel.app</w:t>
+      </w:r>
+    </w:p>
+    <w:p>
+      <w:pPr>
+        <w:spacing w:after="120" w:before="0" w:line="269" w:lineRule="auto"/>
+      </w:pPr>
+      <w:r>
+        <w:rPr>
+          <w:rFonts w:ascii="Calibri" w:hAnsi="Calibri" w:eastAsia="宋体"/>
+          <w:b w:val="0"/>
+          <w:sz w:val="22"/>
+        </w:rPr>
+        <w:t>代码  https://github.com/entice0328-cloud/yingxi-analytics</w:t>
+      </w:r>
+    </w:p>
+    <w:p>
+      <w:pPr>
+        <w:spacing w:after="80" w:before="200" w:line="269" w:lineRule="auto"/>
         <w:pBdr>
           <w:bottom w:val="single" w:sz="6" w:space="1" w:color="1F6F6A"/>
         </w:pBdr>
@@ -54,7 +79,7 @@
         <w:rPr>
           <w:rFonts w:ascii="Calibri" w:hAnsi="Calibri" w:eastAsia="宋体"/>
           <w:b/>
-          <w:color w:val="181818"/>
+          <w:color w:val="1F6F6A"/>
           <w:sz w:val="24"/>
         </w:rPr>
         <w:t>求职意向</w:t>
@@ -62,20 +87,20 @@
     </w:p>
     <w:p>
       <w:pPr>
-        <w:spacing w:after="40" w:line="276" w:lineRule="auto"/>
+        <w:spacing w:after="60" w:before="0" w:line="269" w:lineRule="auto"/>
       </w:pPr>
       <w:r>
         <w:rPr>
           <w:rFonts w:ascii="Calibri" w:hAnsi="Calibri" w:eastAsia="宋体"/>
           <w:b w:val="0"/>
-          <w:sz w:val="21"/>
+          <w:sz w:val="22"/>
         </w:rPr>
-        <w:t>数据分析实习生、数据运营、商业分析、BI。可立即到武汉实习，接受数据取数、看板、周报与业务复盘。</w:t>
+        <w:t>数据分析实习生、数据运营、商业分析、BI。计划 2026 年 1 月到武汉实习，10 月起可沟通，12 月可面试。接受取数、看板、周报与业务复盘。</w:t>
       </w:r>
     </w:p>
     <w:p>
       <w:pPr>
-        <w:spacing w:before="200" w:after="80"/>
+        <w:spacing w:after="80" w:before="200" w:line="269" w:lineRule="auto"/>
         <w:pBdr>
           <w:bottom w:val="single" w:sz="6" w:space="1" w:color="1F6F6A"/>
         </w:pBdr>
@@ -84,7 +109,7 @@
         <w:rPr>
           <w:rFonts w:ascii="Calibri" w:hAnsi="Calibri" w:eastAsia="宋体"/>
           <w:b/>
-          <w:color w:val="181818"/>
+          <w:color w:val="1F6F6A"/>
           <w:sz w:val="24"/>
         </w:rPr>
         <w:t>教育背景</w:t>
@@ -92,46 +117,46 @@
     </w:p>
     <w:p>
       <w:pPr>
-        <w:spacing w:after="40" w:line="276" w:lineRule="auto"/>
+        <w:spacing w:after="60" w:before="0" w:line="269" w:lineRule="auto"/>
       </w:pPr>
       <w:r>
         <w:rPr>
           <w:rFonts w:ascii="Calibri" w:hAnsi="Calibri" w:eastAsia="宋体"/>
           <w:b/>
-          <w:sz w:val="21"/>
+          <w:sz w:val="22"/>
         </w:rPr>
         <w:t>Asia Pacific University of Technology &amp; Innovation（APU）</w:t>
       </w:r>
     </w:p>
     <w:p>
       <w:pPr>
-        <w:spacing w:after="40" w:line="276" w:lineRule="auto"/>
+        <w:spacing w:after="60" w:before="0" w:line="269" w:lineRule="auto"/>
       </w:pPr>
       <w:r>
         <w:rPr>
           <w:rFonts w:ascii="Calibri" w:hAnsi="Calibri" w:eastAsia="宋体"/>
           <w:b w:val="0"/>
-          <w:sz w:val="21"/>
+          <w:sz w:val="22"/>
         </w:rPr>
         <w:t>Bachelor of Computer Science (Data Analytics)    2025 – 至今    本科二年级</w:t>
       </w:r>
     </w:p>
     <w:p>
       <w:pPr>
-        <w:spacing w:after="40" w:line="276" w:lineRule="auto"/>
+        <w:spacing w:after="60" w:before="0" w:line="269" w:lineRule="auto"/>
       </w:pPr>
       <w:r>
         <w:rPr>
           <w:rFonts w:ascii="Calibri" w:hAnsi="Calibri" w:eastAsia="宋体"/>
           <w:b w:val="0"/>
-          <w:sz w:val="21"/>
+          <w:sz w:val="22"/>
         </w:rPr>
-        <w:t>课程覆盖 SQL / 数据库、Python、统计分析与可视化，项目以业务取数和经营分析为主。</w:t>
+        <w:t>课程覆盖 SQL / 数据库、Python、统计分析与可视化。</w:t>
       </w:r>
     </w:p>
     <w:p>
       <w:pPr>
-        <w:spacing w:before="200" w:after="80"/>
+        <w:spacing w:after="80" w:before="200" w:line="269" w:lineRule="auto"/>
         <w:pBdr>
           <w:bottom w:val="single" w:sz="6" w:space="1" w:color="1F6F6A"/>
         </w:pBdr>
@@ -140,7 +165,7 @@
         <w:rPr>
           <w:rFonts w:ascii="Calibri" w:hAnsi="Calibri" w:eastAsia="宋体"/>
           <w:b/>
-          <w:color w:val="181818"/>
+          <w:color w:val="1F6F6A"/>
           <w:sz w:val="24"/>
         </w:rPr>
         <w:t>技能</w:t>
@@ -148,46 +173,46 @@
     </w:p>
     <w:p>
       <w:pPr>
-        <w:spacing w:after="40" w:line="276" w:lineRule="auto"/>
+        <w:spacing w:after="60" w:before="0" w:line="269" w:lineRule="auto"/>
       </w:pPr>
       <w:r>
         <w:rPr>
           <w:rFonts w:ascii="Calibri" w:hAnsi="Calibri" w:eastAsia="宋体"/>
           <w:b w:val="0"/>
-          <w:sz w:val="21"/>
+          <w:sz w:val="22"/>
         </w:rPr>
-        <w:t>取数与仓库：SQL、MySQL、关系建模、多表聚合、条件筛选</w:t>
+        <w:t>取数：SQL、MySQL、多表聚合、条件筛选</w:t>
       </w:r>
     </w:p>
     <w:p>
       <w:pPr>
-        <w:spacing w:after="40" w:line="276" w:lineRule="auto"/>
+        <w:spacing w:after="60" w:before="0" w:line="269" w:lineRule="auto"/>
       </w:pPr>
       <w:r>
         <w:rPr>
           <w:rFonts w:ascii="Calibri" w:hAnsi="Calibri" w:eastAsia="宋体"/>
           <w:b w:val="0"/>
-          <w:sz w:val="21"/>
+          <w:sz w:val="22"/>
         </w:rPr>
         <w:t>分析：Python、R、描述统计、对比 / 漏斗 / 结构分析</w:t>
       </w:r>
     </w:p>
     <w:p>
       <w:pPr>
-        <w:spacing w:after="40" w:line="276" w:lineRule="auto"/>
+        <w:spacing w:after="60" w:before="0" w:line="269" w:lineRule="auto"/>
       </w:pPr>
       <w:r>
         <w:rPr>
           <w:rFonts w:ascii="Calibri" w:hAnsi="Calibri" w:eastAsia="宋体"/>
           <w:b w:val="0"/>
-          <w:sz w:val="21"/>
+          <w:sz w:val="22"/>
         </w:rPr>
-        <w:t>呈现：Power BI、经营看板、指标口径说明</w:t>
+        <w:t>呈现：经营看板、指标口径说明；Power BI（课程使用）</w:t>
       </w:r>
     </w:p>
     <w:p>
       <w:pPr>
-        <w:spacing w:before="200" w:after="80"/>
+        <w:spacing w:after="80" w:before="200" w:line="269" w:lineRule="auto"/>
         <w:pBdr>
           <w:bottom w:val="single" w:sz="6" w:space="1" w:color="1F6F6A"/>
         </w:pBdr>
@@ -196,7 +221,7 @@
         <w:rPr>
           <w:rFonts w:ascii="Calibri" w:hAnsi="Calibri" w:eastAsia="宋体"/>
           <w:b/>
-          <w:color w:val="181818"/>
+          <w:color w:val="1F6F6A"/>
           <w:sz w:val="24"/>
         </w:rPr>
         <w:t>项目经历</w:t>
@@ -204,34 +229,34 @@
     </w:p>
     <w:p>
       <w:pPr>
-        <w:spacing w:after="40" w:line="276" w:lineRule="auto"/>
+        <w:spacing w:after="60" w:before="0" w:line="269" w:lineRule="auto"/>
       </w:pPr>
       <w:r>
         <w:rPr>
           <w:rFonts w:ascii="Calibri" w:hAnsi="Calibri" w:eastAsia="宋体"/>
           <w:b/>
-          <w:sz w:val="21"/>
+          <w:sz w:val="22"/>
         </w:rPr>
-        <w:t>营析 · 电商经营分析台    SQL 口径 · 聚合分析 · 经营看板</w:t>
+        <w:t>营析 · 电商经营分析台    指标口径 · 经营看板</w:t>
       </w:r>
     </w:p>
     <w:p>
       <w:pPr>
-        <w:spacing w:after="40" w:line="276" w:lineRule="auto"/>
+        <w:spacing w:after="60" w:before="0" w:line="269" w:lineRule="auto"/>
       </w:pPr>
       <w:r>
         <w:rPr>
           <w:rFonts w:ascii="Calibri" w:hAnsi="Calibri" w:eastAsia="宋体"/>
           <w:b w:val="0"/>
-          <w:sz w:val="21"/>
+          <w:sz w:val="22"/>
         </w:rPr>
-        <w:t>独立完成可演示的经营分析作品。用固定种子生成 90 天店铺样本（截至 2026-09-12），在看板中计算 GMV、客单价、退货率、转化漏斗与新老客结构，并给出可执行结论。</w:t>
+        <w:t>独立完成可在线演示的经营分析作品。用固定种子生成 90 天店铺样本数据（非真实商家后台），计算 GMV、客单价、退货率、转化漏斗与新老客结构，并给出可执行结论。方法页提供同等口径 SQL。</w:t>
       </w:r>
     </w:p>
     <w:p>
       <w:pPr>
         <w:pStyle w:val="ListBullet"/>
-        <w:spacing w:after="20" w:line="269" w:lineRule="auto"/>
+        <w:spacing w:after="40"/>
       </w:pPr>
       <w:r>
         <w:rPr>
@@ -245,7 +270,7 @@
     <w:p>
       <w:pPr>
         <w:pStyle w:val="ListBullet"/>
-        <w:spacing w:after="20" w:line="269" w:lineRule="auto"/>
+        <w:spacing w:after="40"/>
       </w:pPr>
       <w:r>
         <w:rPr>
@@ -253,13 +278,13 @@
           <w:b w:val="0"/>
           <w:sz w:val="21"/>
         </w:rPr>
-        <w:t>按类目拆退货：家居收纳退货率 18.8%，高于个护清洁 4.3%。建议先改详情页预期和质检，而不是继续放量。</w:t>
+        <w:t>家居收纳退货率 18.8%，高于个护清洁 4.3%。建议先改详情页预期和质检，而不是继续放量。</w:t>
       </w:r>
     </w:p>
     <w:p>
       <w:pPr>
         <w:pStyle w:val="ListBullet"/>
-        <w:spacing w:after="20" w:line="269" w:lineRule="auto"/>
+        <w:spacing w:after="40"/>
       </w:pPr>
       <w:r>
         <w:rPr>
@@ -267,13 +292,13 @@
           <w:b w:val="0"/>
           <w:sz w:val="21"/>
         </w:rPr>
-        <w:t>漏斗显示加购→下单为 35.1%，是最大流失；信息流广告浏览→支付 8.5%，老客复访 30.5%。建议把预算转向已验证渠道。</w:t>
+        <w:t>加购→下单 35.1% 为最大流失；信息流浏览→支付 8.5%，老客复访 30.5%。建议预算转向已验证渠道。</w:t>
       </w:r>
     </w:p>
     <w:p>
       <w:pPr>
         <w:pStyle w:val="ListBullet"/>
-        <w:spacing w:after="20" w:line="269" w:lineRule="auto"/>
+        <w:spacing w:after="40"/>
       </w:pPr>
       <w:r>
         <w:rPr>
@@ -286,75 +311,20 @@
     </w:p>
     <w:p>
       <w:pPr>
-        <w:spacing w:after="40" w:line="276" w:lineRule="auto"/>
-      </w:pPr>
-      <w:r>
-        <w:rPr>
-          <w:rFonts w:ascii="Calibri" w:hAnsi="Calibri" w:eastAsia="宋体"/>
-          <w:b/>
-          <w:sz w:val="21"/>
-        </w:rPr>
-        <w:t>航空票务管理与查询系统    MySQL · 数据库设计 · SQL</w:t>
-      </w:r>
-    </w:p>
-    <w:p>
-      <w:pPr>
-        <w:spacing w:after="40" w:line="276" w:lineRule="auto"/>
+        <w:spacing w:after="60" w:before="0" w:line="269" w:lineRule="auto"/>
       </w:pPr>
       <w:r>
         <w:rPr>
           <w:rFonts w:ascii="Calibri" w:hAnsi="Calibri" w:eastAsia="宋体"/>
           <w:b w:val="0"/>
-          <w:sz w:val="21"/>
+          <w:sz w:val="22"/>
         </w:rPr>
-        <w:t>课程项目。按出票流程梳理航班、乘客、订单实体，完成关系型库表设计，并用 SQL 做班期筛选、客票检索与聚合统计，验证约束与查询逻辑。</w:t>
+        <w:t>在线演示：https://yingxi-analytics.vercel.app</w:t>
       </w:r>
     </w:p>
     <w:p>
       <w:pPr>
-        <w:pStyle w:val="ListBullet"/>
-        <w:spacing w:after="20" w:line="269" w:lineRule="auto"/>
-      </w:pPr>
-      <w:r>
-        <w:rPr>
-          <w:rFonts w:ascii="Calibri" w:hAnsi="Calibri" w:eastAsia="宋体"/>
-          <w:b w:val="0"/>
-          <w:sz w:val="21"/>
-        </w:rPr>
-        <w:t>把票务流程落成可查询的表结构，而不是只画概念图。</w:t>
-      </w:r>
-    </w:p>
-    <w:p>
-      <w:pPr>
-        <w:pStyle w:val="ListBullet"/>
-        <w:spacing w:after="20" w:line="269" w:lineRule="auto"/>
-      </w:pPr>
-      <w:r>
-        <w:rPr>
-          <w:rFonts w:ascii="Calibri" w:hAnsi="Calibri" w:eastAsia="宋体"/>
-          <w:b w:val="0"/>
-          <w:sz w:val="21"/>
-        </w:rPr>
-        <w:t>编写筛选、排序、条件与聚合查询，覆盖常见客服取数场景。</w:t>
-      </w:r>
-    </w:p>
-    <w:p>
-      <w:pPr>
-        <w:pStyle w:val="ListBullet"/>
-        <w:spacing w:after="20" w:line="269" w:lineRule="auto"/>
-      </w:pPr>
-      <w:r>
-        <w:rPr>
-          <w:rFonts w:ascii="Calibri" w:hAnsi="Calibri" w:eastAsia="宋体"/>
-          <w:b w:val="0"/>
-          <w:sz w:val="21"/>
-        </w:rPr>
-        <w:t>用测试数据检查关联查询与空结果，避免「能建表不能回答问题」。</w:t>
-      </w:r>
-    </w:p>
-    <w:p>
-      <w:pPr>
-        <w:spacing w:before="200" w:after="80"/>
+        <w:spacing w:after="80" w:before="200" w:line="269" w:lineRule="auto"/>
         <w:pBdr>
           <w:bottom w:val="single" w:sz="6" w:space="1" w:color="1F6F6A"/>
         </w:pBdr>
@@ -363,7 +333,7 @@
         <w:rPr>
           <w:rFonts w:ascii="Calibri" w:hAnsi="Calibri" w:eastAsia="宋体"/>
           <w:b/>
-          <w:color w:val="181818"/>
+          <w:color w:val="1F6F6A"/>
           <w:sz w:val="24"/>
         </w:rPr>
         <w:t>个人评价</w:t>
@@ -371,20 +341,20 @@
     </w:p>
     <w:p>
       <w:pPr>
-        <w:spacing w:after="40" w:line="276" w:lineRule="auto"/>
+        <w:spacing w:after="60" w:before="0" w:line="269" w:lineRule="auto"/>
       </w:pPr>
       <w:r>
         <w:rPr>
           <w:rFonts w:ascii="Calibri" w:hAnsi="Calibri" w:eastAsia="宋体"/>
           <w:b w:val="0"/>
-          <w:sz w:val="21"/>
+          <w:sz w:val="22"/>
         </w:rPr>
-        <w:t>能把业务问题拆成指标和 SQL，再写成运营听得懂的结论。希望在武汉的数据运营 / BI 团队里做取数、看板和复盘，而不是只交分析作业。</w:t>
+        <w:t>能把业务问题拆成指标和查询口径，再写成运营听得懂的结论。希望在武汉的数据运营 / BI 团队做取数、看板和复盘。</w:t>
       </w:r>
     </w:p>
     <w:sectPr>
       <w:pgSz w:w="12240" w:h="15840"/>
-      <w:pgMar w:top="907" w:right="1020" w:bottom="907" w:left="1020" w:header="720" w:footer="720" w:gutter="0"/>
+      <w:pgMar w:top="850" w:right="1020" w:bottom="850" w:left="1020" w:header="720" w:footer="720" w:gutter="0"/>
       <w:cols w:space="720"/>
       <w:docGrid w:linePitch="360"/>
     </w:sectPr>

</xml_diff>

<commit_message>
Update the Word resume to match the coursework rewrite.
Co-authored-by: entice0328 <entice0328@gmail.com>
</commit_message>
<xml_diff>
--- a/resume/张力元-数据分析实习生.docx
+++ b/resume/张力元-数据分析实习生.docx
@@ -4,73 +4,73 @@
   <w:body>
     <w:p>
       <w:pPr>
-        <w:spacing w:after="40" w:before="0" w:line="269" w:lineRule="auto"/>
+        <w:spacing w:after="20" w:before="0" w:line="259" w:lineRule="auto"/>
       </w:pPr>
       <w:r>
         <w:rPr>
           <w:rFonts w:ascii="Calibri" w:hAnsi="Calibri" w:eastAsia="宋体"/>
           <w:b/>
-          <w:sz w:val="44"/>
+          <w:sz w:val="40"/>
         </w:rPr>
         <w:t>张力元</w:t>
       </w:r>
     </w:p>
     <w:p>
       <w:pPr>
-        <w:spacing w:after="40" w:before="0" w:line="269" w:lineRule="auto"/>
+        <w:spacing w:after="20" w:before="0" w:line="259" w:lineRule="auto"/>
       </w:pPr>
       <w:r>
         <w:rPr>
           <w:rFonts w:ascii="Calibri" w:hAnsi="Calibri" w:eastAsia="宋体"/>
           <w:b w:val="0"/>
           <w:color w:val="505050"/>
-          <w:sz w:val="22"/>
+          <w:sz w:val="21"/>
         </w:rPr>
         <w:t>数据分析实习生  |  数据运营 / 商业分析 / BI  |  求职城市：武汉</w:t>
       </w:r>
     </w:p>
     <w:p>
       <w:pPr>
-        <w:spacing w:after="20" w:before="0" w:line="269" w:lineRule="auto"/>
+        <w:spacing w:after="0" w:before="0" w:line="259" w:lineRule="auto"/>
       </w:pPr>
       <w:r>
         <w:rPr>
           <w:rFonts w:ascii="Calibri" w:hAnsi="Calibri" w:eastAsia="宋体"/>
           <w:b w:val="0"/>
-          <w:sz w:val="22"/>
+          <w:sz w:val="21"/>
         </w:rPr>
         <w:t>15752886130    entice0328@gmail.com</w:t>
       </w:r>
     </w:p>
     <w:p>
       <w:pPr>
-        <w:spacing w:after="0" w:before="0" w:line="269" w:lineRule="auto"/>
+        <w:spacing w:after="0" w:before="0" w:line="259" w:lineRule="auto"/>
       </w:pPr>
       <w:r>
         <w:rPr>
           <w:rFonts w:ascii="Calibri" w:hAnsi="Calibri" w:eastAsia="宋体"/>
           <w:b w:val="0"/>
-          <w:sz w:val="22"/>
+          <w:sz w:val="21"/>
         </w:rPr>
         <w:t>演示  https://yingxi-analytics.vercel.app</w:t>
       </w:r>
     </w:p>
     <w:p>
       <w:pPr>
-        <w:spacing w:after="120" w:before="0" w:line="269" w:lineRule="auto"/>
+        <w:spacing w:after="80" w:before="0" w:line="259" w:lineRule="auto"/>
       </w:pPr>
       <w:r>
         <w:rPr>
           <w:rFonts w:ascii="Calibri" w:hAnsi="Calibri" w:eastAsia="宋体"/>
           <w:b w:val="0"/>
-          <w:sz w:val="22"/>
+          <w:sz w:val="21"/>
         </w:rPr>
         <w:t>代码  https://github.com/entice0328-cloud/yingxi-analytics</w:t>
       </w:r>
     </w:p>
     <w:p>
       <w:pPr>
-        <w:spacing w:after="80" w:before="200" w:line="269" w:lineRule="auto"/>
+        <w:spacing w:after="60" w:before="160" w:line="259" w:lineRule="auto"/>
         <w:pBdr>
           <w:bottom w:val="single" w:sz="6" w:space="1" w:color="1F6F6A"/>
         </w:pBdr>
@@ -87,20 +87,20 @@
     </w:p>
     <w:p>
       <w:pPr>
-        <w:spacing w:after="60" w:before="0" w:line="269" w:lineRule="auto"/>
+        <w:spacing w:after="40" w:before="0" w:line="259" w:lineRule="auto"/>
       </w:pPr>
       <w:r>
         <w:rPr>
           <w:rFonts w:ascii="Calibri" w:hAnsi="Calibri" w:eastAsia="宋体"/>
           <w:b w:val="0"/>
-          <w:sz w:val="22"/>
+          <w:sz w:val="21"/>
         </w:rPr>
-        <w:t>数据分析实习生、数据运营、商业分析、BI。计划 2026 年 1 月到武汉实习，10 月起可沟通，12 月可面试。接受取数、看板、周报与业务复盘。</w:t>
+        <w:t>数据分析实习生、数据运营、商业分析、BI。计划 2026 年 1 月到武汉实习，10 月起可沟通，12 月可面试。</w:t>
       </w:r>
     </w:p>
     <w:p>
       <w:pPr>
-        <w:spacing w:after="80" w:before="200" w:line="269" w:lineRule="auto"/>
+        <w:spacing w:after="60" w:before="160" w:line="259" w:lineRule="auto"/>
         <w:pBdr>
           <w:bottom w:val="single" w:sz="6" w:space="1" w:color="1F6F6A"/>
         </w:pBdr>
@@ -117,46 +117,170 @@
     </w:p>
     <w:p>
       <w:pPr>
-        <w:spacing w:after="60" w:before="0" w:line="269" w:lineRule="auto"/>
+        <w:spacing w:after="40" w:before="0" w:line="259" w:lineRule="auto"/>
       </w:pPr>
       <w:r>
         <w:rPr>
           <w:rFonts w:ascii="Calibri" w:hAnsi="Calibri" w:eastAsia="宋体"/>
           <w:b/>
-          <w:sz w:val="22"/>
+          <w:sz w:val="21"/>
         </w:rPr>
         <w:t>Asia Pacific University of Technology &amp; Innovation（APU）</w:t>
       </w:r>
     </w:p>
     <w:p>
       <w:pPr>
-        <w:spacing w:after="60" w:before="0" w:line="269" w:lineRule="auto"/>
+        <w:spacing w:after="40" w:before="0" w:line="259" w:lineRule="auto"/>
       </w:pPr>
       <w:r>
         <w:rPr>
           <w:rFonts w:ascii="Calibri" w:hAnsi="Calibri" w:eastAsia="宋体"/>
           <w:b w:val="0"/>
-          <w:sz w:val="22"/>
+          <w:sz w:val="21"/>
         </w:rPr>
         <w:t>Bachelor of Computer Science (Data Analytics)    2025 – 至今    本科二年级</w:t>
       </w:r>
     </w:p>
     <w:p>
       <w:pPr>
-        <w:spacing w:after="60" w:before="0" w:line="269" w:lineRule="auto"/>
+        <w:spacing w:after="40" w:before="0" w:line="259" w:lineRule="auto"/>
       </w:pPr>
       <w:r>
         <w:rPr>
           <w:rFonts w:ascii="Calibri" w:hAnsi="Calibri" w:eastAsia="宋体"/>
           <w:b w:val="0"/>
-          <w:sz w:val="22"/>
+          <w:sz w:val="21"/>
         </w:rPr>
-        <w:t>课程覆盖 SQL / 数据库、Python、统计分析与可视化。</w:t>
+        <w:t>计算机专业，方向是数据分析。下面写学过什么、因此能做什么。</w:t>
       </w:r>
     </w:p>
     <w:p>
       <w:pPr>
-        <w:spacing w:after="80" w:before="200" w:line="269" w:lineRule="auto"/>
+        <w:spacing w:after="40" w:before="80" w:line="259" w:lineRule="auto"/>
+      </w:pPr>
+      <w:r>
+        <w:rPr>
+          <w:rFonts w:ascii="Calibri" w:hAnsi="Calibri" w:eastAsia="宋体"/>
+          <w:b/>
+          <w:sz w:val="21"/>
+        </w:rPr>
+        <w:t>大一已修（计算机基础）</w:t>
+      </w:r>
+    </w:p>
+    <w:p>
+      <w:pPr>
+        <w:pStyle w:val="ListBullet"/>
+        <w:spacing w:after="20" w:line="252" w:lineRule="auto"/>
+      </w:pPr>
+      <w:r>
+        <w:rPr>
+          <w:rFonts w:ascii="Calibri" w:hAnsi="Calibri" w:eastAsia="宋体"/>
+          <w:b w:val="0"/>
+          <w:sz w:val="21"/>
+        </w:rPr>
+        <w:t>编程：Python Programming、Introduction to C Programming。能用 Python、C 写小程序。</w:t>
+      </w:r>
+    </w:p>
+    <w:p>
+      <w:pPr>
+        <w:pStyle w:val="ListBullet"/>
+        <w:spacing w:after="20" w:line="252" w:lineRule="auto"/>
+      </w:pPr>
+      <w:r>
+        <w:rPr>
+          <w:rFonts w:ascii="Calibri" w:hAnsi="Calibri" w:eastAsia="宋体"/>
+          <w:b w:val="0"/>
+          <w:sz w:val="21"/>
+        </w:rPr>
+        <w:t>数据库与分析设计：Introduction to Databases、Systems Analysis and Design。能建表，用 SQL 做筛选、关联和汇总。</w:t>
+      </w:r>
+    </w:p>
+    <w:p>
+      <w:pPr>
+        <w:pStyle w:val="ListBullet"/>
+        <w:spacing w:after="20" w:line="252" w:lineRule="auto"/>
+      </w:pPr>
+      <w:r>
+        <w:rPr>
+          <w:rFonts w:ascii="Calibri" w:hAnsi="Calibri" w:eastAsia="宋体"/>
+          <w:b w:val="0"/>
+          <w:sz w:val="21"/>
+        </w:rPr>
+        <w:t>计算机系统：Introduction to Networking、Systems Software and Computing Concepts、Integrated Computer Systems、Mathematical Concepts for Computing、Introduction to Artificial Intelligence。覆盖网络、操作系统与组成、计算数学和人工智能入门。</w:t>
+      </w:r>
+    </w:p>
+    <w:p>
+      <w:pPr>
+        <w:spacing w:after="40" w:before="80" w:line="259" w:lineRule="auto"/>
+      </w:pPr>
+      <w:r>
+        <w:rPr>
+          <w:rFonts w:ascii="Calibri" w:hAnsi="Calibri" w:eastAsia="宋体"/>
+          <w:b/>
+          <w:sz w:val="21"/>
+        </w:rPr>
+        <w:t>大二在修（没上过的请删掉）</w:t>
+      </w:r>
+    </w:p>
+    <w:p>
+      <w:pPr>
+        <w:pStyle w:val="ListBullet"/>
+        <w:spacing w:after="20" w:line="252" w:lineRule="auto"/>
+      </w:pPr>
+      <w:r>
+        <w:rPr>
+          <w:rFonts w:ascii="Calibri" w:hAnsi="Calibri" w:eastAsia="宋体"/>
+          <w:b w:val="0"/>
+          <w:sz w:val="21"/>
+        </w:rPr>
+        <w:t>Object Oriented Development with Java：用 Java 按面向对象方式拆模块。</w:t>
+      </w:r>
+    </w:p>
+    <w:p>
+      <w:pPr>
+        <w:pStyle w:val="ListBullet"/>
+        <w:spacing w:after="20" w:line="252" w:lineRule="auto"/>
+      </w:pPr>
+      <w:r>
+        <w:rPr>
+          <w:rFonts w:ascii="Calibri" w:hAnsi="Calibri" w:eastAsia="宋体"/>
+          <w:b w:val="0"/>
+          <w:sz w:val="21"/>
+        </w:rPr>
+        <w:t>Probability and Statistical Modelling：描述统计、相关与回归。课程中使用过 R、Power BI。</w:t>
+      </w:r>
+    </w:p>
+    <w:p>
+      <w:pPr>
+        <w:pStyle w:val="ListBullet"/>
+        <w:spacing w:after="20" w:line="252" w:lineRule="auto"/>
+      </w:pPr>
+      <w:r>
+        <w:rPr>
+          <w:rFonts w:ascii="Calibri" w:hAnsi="Calibri" w:eastAsia="宋体"/>
+          <w:b w:val="0"/>
+          <w:sz w:val="21"/>
+        </w:rPr>
+        <w:t>Data Structures、Data Management：数据结构与数据管理。</w:t>
+      </w:r>
+    </w:p>
+    <w:p>
+      <w:pPr>
+        <w:pStyle w:val="ListBullet"/>
+        <w:spacing w:after="20" w:line="252" w:lineRule="auto"/>
+      </w:pPr>
+      <w:r>
+        <w:rPr>
+          <w:rFonts w:ascii="Calibri" w:hAnsi="Calibri" w:eastAsia="宋体"/>
+          <w:b w:val="0"/>
+          <w:sz w:val="21"/>
+        </w:rPr>
+        <w:t>Data Mining and Predictive Modelling：数据挖掘与预测模型入门。</w:t>
+      </w:r>
+    </w:p>
+    <w:p>
+      <w:pPr>
+        <w:spacing w:after="60" w:before="160" w:line="259" w:lineRule="auto"/>
         <w:pBdr>
           <w:bottom w:val="single" w:sz="6" w:space="1" w:color="1F6F6A"/>
         </w:pBdr>
@@ -168,51 +292,54 @@
           <w:color w:val="1F6F6A"/>
           <w:sz w:val="24"/>
         </w:rPr>
-        <w:t>技能</w:t>
+        <w:t>目前能独立做的事</w:t>
       </w:r>
     </w:p>
     <w:p>
       <w:pPr>
-        <w:spacing w:after="60" w:before="0" w:line="269" w:lineRule="auto"/>
+        <w:pStyle w:val="ListBullet"/>
+        <w:spacing w:after="20" w:line="252" w:lineRule="auto"/>
       </w:pPr>
       <w:r>
         <w:rPr>
           <w:rFonts w:ascii="Calibri" w:hAnsi="Calibri" w:eastAsia="宋体"/>
           <w:b w:val="0"/>
-          <w:sz w:val="22"/>
+          <w:sz w:val="21"/>
         </w:rPr>
-        <w:t>取数：SQL、MySQL、多表聚合、条件筛选</w:t>
+        <w:t>用 SQL 把订单、类目、渠道连起来，算出营业额、客单价、退货率和转化率。</w:t>
       </w:r>
     </w:p>
     <w:p>
       <w:pPr>
-        <w:spacing w:after="60" w:before="0" w:line="269" w:lineRule="auto"/>
+        <w:pStyle w:val="ListBullet"/>
+        <w:spacing w:after="20" w:line="252" w:lineRule="auto"/>
       </w:pPr>
       <w:r>
         <w:rPr>
           <w:rFonts w:ascii="Calibri" w:hAnsi="Calibri" w:eastAsia="宋体"/>
           <w:b w:val="0"/>
-          <w:sz w:val="22"/>
+          <w:sz w:val="21"/>
         </w:rPr>
-        <w:t>分析：Python、R、描述统计、对比 / 漏斗 / 结构分析</w:t>
+        <w:t>把这些指标做成可以筛选的网页，并写成运营能看懂的结论。</w:t>
       </w:r>
     </w:p>
     <w:p>
       <w:pPr>
-        <w:spacing w:after="60" w:before="0" w:line="269" w:lineRule="auto"/>
+        <w:pStyle w:val="ListBullet"/>
+        <w:spacing w:after="20" w:line="252" w:lineRule="auto"/>
       </w:pPr>
       <w:r>
         <w:rPr>
           <w:rFonts w:ascii="Calibri" w:hAnsi="Calibri" w:eastAsia="宋体"/>
           <w:b w:val="0"/>
-          <w:sz w:val="22"/>
+          <w:sz w:val="21"/>
         </w:rPr>
-        <w:t>呈现：经营看板、指标口径说明；Power BI（课程使用）</w:t>
+        <w:t>用 Python、C、Java 完成课程里的程序，而不只是会打开软件。</w:t>
       </w:r>
     </w:p>
     <w:p>
       <w:pPr>
-        <w:spacing w:after="80" w:before="200" w:line="269" w:lineRule="auto"/>
+        <w:spacing w:after="60" w:before="160" w:line="259" w:lineRule="auto"/>
         <w:pBdr>
           <w:bottom w:val="single" w:sz="6" w:space="1" w:color="1F6F6A"/>
         </w:pBdr>
@@ -229,34 +356,20 @@
     </w:p>
     <w:p>
       <w:pPr>
-        <w:spacing w:after="60" w:before="0" w:line="269" w:lineRule="auto"/>
+        <w:spacing w:after="40" w:before="0" w:line="259" w:lineRule="auto"/>
       </w:pPr>
       <w:r>
         <w:rPr>
           <w:rFonts w:ascii="Calibri" w:hAnsi="Calibri" w:eastAsia="宋体"/>
           <w:b/>
-          <w:sz w:val="22"/>
+          <w:sz w:val="21"/>
         </w:rPr>
-        <w:t>营析 · 电商经营分析台    指标口径 · 经营看板</w:t>
+        <w:t>营析 · 网店经营分析页面</w:t>
       </w:r>
     </w:p>
     <w:p>
       <w:pPr>
-        <w:spacing w:after="60" w:before="0" w:line="269" w:lineRule="auto"/>
-      </w:pPr>
-      <w:r>
-        <w:rPr>
-          <w:rFonts w:ascii="Calibri" w:hAnsi="Calibri" w:eastAsia="宋体"/>
-          <w:b w:val="0"/>
-          <w:sz w:val="22"/>
-        </w:rPr>
-        <w:t>独立完成可在线演示的经营分析作品。用固定种子生成 90 天店铺样本数据（非真实商家后台），计算 GMV、客单价、退货率、转化漏斗与新老客结构，并给出可执行结论。方法页提供同等口径 SQL。</w:t>
-      </w:r>
-    </w:p>
-    <w:p>
-      <w:pPr>
-        <w:pStyle w:val="ListBullet"/>
-        <w:spacing w:after="40"/>
+        <w:spacing w:after="40" w:before="0" w:line="259" w:lineRule="auto"/>
       </w:pPr>
       <w:r>
         <w:rPr>
@@ -264,13 +377,13 @@
           <w:b w:val="0"/>
           <w:sz w:val="21"/>
         </w:rPr>
-        <w:t>近 90 天样本：GMV ¥525,328，订单 6,401，客单价 ¥82，退货率 8.2%，浏览→支付 14.4%。</w:t>
+        <w:t>自己做的分析网页，用来回答：这家店最近赚了多少、货退在哪、客人在哪一步离开、钱是新客还是老客带来的。数据是按固定规则生成的 90 天练习订单，不是某家公司的真实后台。页面可以打开看，指标也可以用 SQL 写出来。</w:t>
       </w:r>
     </w:p>
     <w:p>
       <w:pPr>
         <w:pStyle w:val="ListBullet"/>
-        <w:spacing w:after="40"/>
+        <w:spacing w:after="20" w:line="252" w:lineRule="auto"/>
       </w:pPr>
       <w:r>
         <w:rPr>
@@ -278,13 +391,13 @@
           <w:b w:val="0"/>
           <w:sz w:val="21"/>
         </w:rPr>
-        <w:t>家居收纳退货率 18.8%，高于个护清洁 4.3%。建议先改详情页预期和质检，而不是继续放量。</w:t>
+        <w:t>近 90 天：营业额 ¥525,328，订单 6,401，平均每单 ¥82，退货金额占 8.2%，大约每 100 次浏览有 14 次付款。</w:t>
       </w:r>
     </w:p>
     <w:p>
       <w:pPr>
         <w:pStyle w:val="ListBullet"/>
-        <w:spacing w:after="40"/>
+        <w:spacing w:after="20" w:line="252" w:lineRule="auto"/>
       </w:pPr>
       <w:r>
         <w:rPr>
@@ -292,13 +405,13 @@
           <w:b w:val="0"/>
           <w:sz w:val="21"/>
         </w:rPr>
-        <w:t>加购→下单 35.1% 为最大流失；信息流浏览→支付 8.5%，老客复访 30.5%。建议预算转向已验证渠道。</w:t>
+        <w:t>家居收纳退货约 18.8%，个护清洁约 4.3%。应先核对尺寸说明和质量，而不是继续投广告。</w:t>
       </w:r>
     </w:p>
     <w:p>
       <w:pPr>
         <w:pStyle w:val="ListBullet"/>
-        <w:spacing w:after="40"/>
+        <w:spacing w:after="20" w:line="252" w:lineRule="auto"/>
       </w:pPr>
       <w:r>
         <w:rPr>
@@ -306,55 +419,39 @@
           <w:b w:val="0"/>
           <w:sz w:val="21"/>
         </w:rPr>
-        <w:t>老客贡献 57.2% GMV，复购用户占付款用户 59.2%。建议把部分拉新券改为复购激励。</w:t>
+        <w:t>加购之后只有约 35% 会下单。信息流广告大约 8.5% 的浏览会付款，老客户回访大约 30.5%。预算应先给已经验证过的渠道。</w:t>
       </w:r>
     </w:p>
     <w:p>
       <w:pPr>
-        <w:spacing w:after="60" w:before="0" w:line="269" w:lineRule="auto"/>
+        <w:pStyle w:val="ListBullet"/>
+        <w:spacing w:after="20" w:line="252" w:lineRule="auto"/>
       </w:pPr>
       <w:r>
         <w:rPr>
           <w:rFonts w:ascii="Calibri" w:hAnsi="Calibri" w:eastAsia="宋体"/>
           <w:b w:val="0"/>
-          <w:sz w:val="22"/>
+          <w:sz w:val="21"/>
         </w:rPr>
-        <w:t>在线演示：https://yingxi-analytics.vercel.app</w:t>
+        <w:t>老客户贡献约 57% 的营业额。可以留一部分预算做复购，而不是只发新客券。</w:t>
       </w:r>
     </w:p>
     <w:p>
       <w:pPr>
-        <w:spacing w:after="80" w:before="200" w:line="269" w:lineRule="auto"/>
-        <w:pBdr>
-          <w:bottom w:val="single" w:sz="6" w:space="1" w:color="1F6F6A"/>
-        </w:pBdr>
-      </w:pPr>
-      <w:r>
-        <w:rPr>
-          <w:rFonts w:ascii="Calibri" w:hAnsi="Calibri" w:eastAsia="宋体"/>
-          <w:b/>
-          <w:color w:val="1F6F6A"/>
-          <w:sz w:val="24"/>
-        </w:rPr>
-        <w:t>个人评价</w:t>
-      </w:r>
-    </w:p>
-    <w:p>
-      <w:pPr>
-        <w:spacing w:after="60" w:before="0" w:line="269" w:lineRule="auto"/>
+        <w:spacing w:after="40" w:before="0" w:line="259" w:lineRule="auto"/>
       </w:pPr>
       <w:r>
         <w:rPr>
           <w:rFonts w:ascii="Calibri" w:hAnsi="Calibri" w:eastAsia="宋体"/>
           <w:b w:val="0"/>
-          <w:sz w:val="22"/>
+          <w:sz w:val="21"/>
         </w:rPr>
-        <w:t>能把业务问题拆成指标和查询口径，再写成运营听得懂的结论。希望在武汉的数据运营 / BI 团队做取数、看板和复盘。</w:t>
+        <w:t>在线演示：https://yingxi-analytics.vercel.app</w:t>
       </w:r>
     </w:p>
     <w:sectPr>
       <w:pgSz w:w="12240" w:h="15840"/>
-      <w:pgMar w:top="850" w:right="1020" w:bottom="850" w:left="1020" w:header="720" w:footer="720" w:gutter="0"/>
+      <w:pgMar w:top="737" w:right="907" w:bottom="737" w:left="907" w:header="720" w:footer="720" w:gutter="0"/>
       <w:cols w:space="720"/>
       <w:docGrid w:linePitch="360"/>
     </w:sectPr>

</xml_diff>

<commit_message>
Refresh the Word resume with the same interview-ready detail.
Co-authored-by: entice0328 <entice0328@gmail.com>
</commit_message>
<xml_diff>
--- a/resume/张力元-数据分析实习生.docx
+++ b/resume/张力元-数据分析实习生.docx
@@ -4,167 +4,154 @@
   <w:body>
     <w:p>
       <w:pPr>
-        <w:spacing w:after="20" w:before="0" w:line="259" w:lineRule="auto"/>
+        <w:spacing w:after="20" w:before="0" w:line="252" w:lineRule="auto"/>
       </w:pPr>
       <w:r>
         <w:rPr>
-          <w:rFonts w:ascii="Calibri" w:hAnsi="Calibri" w:eastAsia="宋体"/>
           <w:b/>
           <w:sz w:val="40"/>
+          <w:rFonts w:ascii="Calibri" w:hAnsi="Calibri" w:eastAsia="宋体"/>
         </w:rPr>
         <w:t>张力元</w:t>
       </w:r>
     </w:p>
     <w:p>
       <w:pPr>
-        <w:spacing w:after="20" w:before="0" w:line="259" w:lineRule="auto"/>
+        <w:spacing w:after="20" w:before="0" w:line="252" w:lineRule="auto"/>
       </w:pPr>
       <w:r>
         <w:rPr>
-          <w:rFonts w:ascii="Calibri" w:hAnsi="Calibri" w:eastAsia="宋体"/>
           <w:b w:val="0"/>
           <w:color w:val="505050"/>
           <w:sz w:val="21"/>
+          <w:rFonts w:ascii="Calibri" w:hAnsi="Calibri" w:eastAsia="宋体"/>
         </w:rPr>
         <w:t>数据分析实习生  |  数据运营 / 商业分析 / BI  |  求职城市：武汉</w:t>
       </w:r>
     </w:p>
     <w:p>
       <w:pPr>
-        <w:spacing w:after="0" w:before="0" w:line="259" w:lineRule="auto"/>
+        <w:spacing w:after="0" w:before="0" w:line="252" w:lineRule="auto"/>
       </w:pPr>
       <w:r>
         <w:rPr>
-          <w:rFonts w:ascii="Calibri" w:hAnsi="Calibri" w:eastAsia="宋体"/>
           <w:b w:val="0"/>
           <w:sz w:val="21"/>
+          <w:rFonts w:ascii="Calibri" w:hAnsi="Calibri" w:eastAsia="宋体"/>
         </w:rPr>
         <w:t>15752886130    entice0328@gmail.com</w:t>
       </w:r>
     </w:p>
     <w:p>
       <w:pPr>
-        <w:spacing w:after="0" w:before="0" w:line="259" w:lineRule="auto"/>
+        <w:spacing w:after="0" w:before="0" w:line="252" w:lineRule="auto"/>
       </w:pPr>
       <w:r>
         <w:rPr>
-          <w:rFonts w:ascii="Calibri" w:hAnsi="Calibri" w:eastAsia="宋体"/>
           <w:b w:val="0"/>
           <w:sz w:val="21"/>
+          <w:rFonts w:ascii="Calibri" w:hAnsi="Calibri" w:eastAsia="宋体"/>
         </w:rPr>
         <w:t>演示  https://yingxi-analytics.vercel.app</w:t>
       </w:r>
     </w:p>
     <w:p>
       <w:pPr>
-        <w:spacing w:after="80" w:before="0" w:line="259" w:lineRule="auto"/>
+        <w:spacing w:after="60" w:before="0" w:line="252" w:lineRule="auto"/>
       </w:pPr>
       <w:r>
         <w:rPr>
-          <w:rFonts w:ascii="Calibri" w:hAnsi="Calibri" w:eastAsia="宋体"/>
           <w:b w:val="0"/>
           <w:sz w:val="21"/>
+          <w:rFonts w:ascii="Calibri" w:hAnsi="Calibri" w:eastAsia="宋体"/>
         </w:rPr>
         <w:t>代码  https://github.com/entice0328-cloud/yingxi-analytics</w:t>
       </w:r>
     </w:p>
     <w:p>
       <w:pPr>
-        <w:spacing w:after="60" w:before="160" w:line="259" w:lineRule="auto"/>
+        <w:spacing w:after="40" w:before="140" w:line="252" w:lineRule="auto"/>
         <w:pBdr>
           <w:bottom w:val="single" w:sz="6" w:space="1" w:color="1F6F6A"/>
         </w:pBdr>
       </w:pPr>
       <w:r>
         <w:rPr>
-          <w:rFonts w:ascii="Calibri" w:hAnsi="Calibri" w:eastAsia="宋体"/>
           <w:b/>
           <w:color w:val="1F6F6A"/>
           <w:sz w:val="24"/>
+          <w:rFonts w:ascii="Calibri" w:hAnsi="Calibri" w:eastAsia="宋体"/>
         </w:rPr>
         <w:t>求职意向</w:t>
       </w:r>
     </w:p>
     <w:p>
       <w:pPr>
-        <w:spacing w:after="40" w:before="0" w:line="259" w:lineRule="auto"/>
+        <w:spacing w:after="40" w:before="0" w:line="252" w:lineRule="auto"/>
       </w:pPr>
       <w:r>
         <w:rPr>
-          <w:rFonts w:ascii="Calibri" w:hAnsi="Calibri" w:eastAsia="宋体"/>
           <w:b w:val="0"/>
           <w:sz w:val="21"/>
+          <w:rFonts w:ascii="Calibri" w:hAnsi="Calibri" w:eastAsia="宋体"/>
         </w:rPr>
-        <w:t>数据分析实习生、数据运营、商业分析、BI。计划 2026 年 1 月到武汉实习，10 月起可沟通，12 月可面试。</w:t>
+        <w:t>数据分析实习生、数据运营、商业分析、BI。计划 2026 年 1 月到武汉实习，10 月起可沟通，12 月可面试。可做取数、指标口径、经营看板和周报复盘。</w:t>
       </w:r>
     </w:p>
     <w:p>
       <w:pPr>
-        <w:spacing w:after="60" w:before="160" w:line="259" w:lineRule="auto"/>
+        <w:spacing w:after="40" w:before="140" w:line="252" w:lineRule="auto"/>
         <w:pBdr>
           <w:bottom w:val="single" w:sz="6" w:space="1" w:color="1F6F6A"/>
         </w:pBdr>
       </w:pPr>
       <w:r>
         <w:rPr>
-          <w:rFonts w:ascii="Calibri" w:hAnsi="Calibri" w:eastAsia="宋体"/>
           <w:b/>
           <w:color w:val="1F6F6A"/>
           <w:sz w:val="24"/>
+          <w:rFonts w:ascii="Calibri" w:hAnsi="Calibri" w:eastAsia="宋体"/>
         </w:rPr>
         <w:t>教育背景</w:t>
       </w:r>
     </w:p>
     <w:p>
       <w:pPr>
-        <w:spacing w:after="40" w:before="0" w:line="259" w:lineRule="auto"/>
+        <w:spacing w:after="40" w:before="0" w:line="252" w:lineRule="auto"/>
       </w:pPr>
       <w:r>
         <w:rPr>
-          <w:rFonts w:ascii="Calibri" w:hAnsi="Calibri" w:eastAsia="宋体"/>
           <w:b/>
           <w:sz w:val="21"/>
+          <w:rFonts w:ascii="Calibri" w:hAnsi="Calibri" w:eastAsia="宋体"/>
         </w:rPr>
         <w:t>Asia Pacific University of Technology &amp; Innovation（APU）</w:t>
       </w:r>
     </w:p>
     <w:p>
       <w:pPr>
-        <w:spacing w:after="40" w:before="0" w:line="259" w:lineRule="auto"/>
+        <w:spacing w:after="40" w:before="0" w:line="252" w:lineRule="auto"/>
       </w:pPr>
       <w:r>
         <w:rPr>
-          <w:rFonts w:ascii="Calibri" w:hAnsi="Calibri" w:eastAsia="宋体"/>
           <w:b w:val="0"/>
           <w:sz w:val="21"/>
+          <w:rFonts w:ascii="Calibri" w:hAnsi="Calibri" w:eastAsia="宋体"/>
         </w:rPr>
         <w:t>Bachelor of Computer Science (Data Analytics)    2025 – 至今    本科二年级</w:t>
       </w:r>
     </w:p>
     <w:p>
       <w:pPr>
-        <w:spacing w:after="40" w:before="0" w:line="259" w:lineRule="auto"/>
+        <w:spacing w:after="40" w:before="60" w:line="252" w:lineRule="auto"/>
       </w:pPr>
       <w:r>
         <w:rPr>
-          <w:rFonts w:ascii="Calibri" w:hAnsi="Calibri" w:eastAsia="宋体"/>
-          <w:b w:val="0"/>
-          <w:sz w:val="21"/>
-        </w:rPr>
-        <w:t>计算机专业，方向是数据分析。下面写学过什么、因此能做什么。</w:t>
-      </w:r>
-    </w:p>
-    <w:p>
-      <w:pPr>
-        <w:spacing w:after="40" w:before="80" w:line="259" w:lineRule="auto"/>
-      </w:pPr>
-      <w:r>
-        <w:rPr>
-          <w:rFonts w:ascii="Calibri" w:hAnsi="Calibri" w:eastAsia="宋体"/>
           <w:b/>
           <w:sz w:val="21"/>
+          <w:rFonts w:ascii="Calibri" w:hAnsi="Calibri" w:eastAsia="宋体"/>
         </w:rPr>
-        <w:t>大一已修（计算机基础）</w:t>
+        <w:t>大一已修</w:t>
       </w:r>
     </w:p>
     <w:p>
@@ -174,11 +161,11 @@
       </w:pPr>
       <w:r>
         <w:rPr>
-          <w:rFonts w:ascii="Calibri" w:hAnsi="Calibri" w:eastAsia="宋体"/>
           <w:b w:val="0"/>
           <w:sz w:val="21"/>
+          <w:rFonts w:ascii="Calibri" w:hAnsi="Calibri" w:eastAsia="宋体"/>
         </w:rPr>
-        <w:t>编程：Python Programming、Introduction to C Programming。能用 Python、C 写小程序。</w:t>
+        <w:t>Python Programming：变量、函数、条件、循环、list / dict，用字典做分组计数，读写简单文本。</w:t>
       </w:r>
     </w:p>
     <w:p>
@@ -188,11 +175,11 @@
       </w:pPr>
       <w:r>
         <w:rPr>
-          <w:rFonts w:ascii="Calibri" w:hAnsi="Calibri" w:eastAsia="宋体"/>
           <w:b w:val="0"/>
           <w:sz w:val="21"/>
+          <w:rFonts w:ascii="Calibri" w:hAnsi="Calibri" w:eastAsia="宋体"/>
         </w:rPr>
-        <w:t>数据库与分析设计：Introduction to Databases、Systems Analysis and Design。能建表，用 SQL 做筛选、关联和汇总。</w:t>
+        <w:t>Introduction to C Programming：基本语法、分支、循环和函数。</w:t>
       </w:r>
     </w:p>
     <w:p>
@@ -202,24 +189,11 @@
       </w:pPr>
       <w:r>
         <w:rPr>
-          <w:rFonts w:ascii="Calibri" w:hAnsi="Calibri" w:eastAsia="宋体"/>
           <w:b w:val="0"/>
           <w:sz w:val="21"/>
+          <w:rFonts w:ascii="Calibri" w:hAnsi="Calibri" w:eastAsia="宋体"/>
         </w:rPr>
-        <w:t>计算机系统：Introduction to Networking、Systems Software and Computing Concepts、Integrated Computer Systems、Mathematical Concepts for Computing、Introduction to Artificial Intelligence。覆盖网络、操作系统与组成、计算数学和人工智能入门。</w:t>
-      </w:r>
-    </w:p>
-    <w:p>
-      <w:pPr>
-        <w:spacing w:after="40" w:before="80" w:line="259" w:lineRule="auto"/>
-      </w:pPr>
-      <w:r>
-        <w:rPr>
-          <w:rFonts w:ascii="Calibri" w:hAnsi="Calibri" w:eastAsia="宋体"/>
-          <w:b/>
-          <w:sz w:val="21"/>
-        </w:rPr>
-        <w:t>大二在修（没上过的请删掉）</w:t>
+        <w:t>Introduction to Databases：建表、主键与表关系；SQL 的 WHERE、排序和聚合。</w:t>
       </w:r>
     </w:p>
     <w:p>
@@ -229,11 +203,11 @@
       </w:pPr>
       <w:r>
         <w:rPr>
-          <w:rFonts w:ascii="Calibri" w:hAnsi="Calibri" w:eastAsia="宋体"/>
           <w:b w:val="0"/>
           <w:sz w:val="21"/>
+          <w:rFonts w:ascii="Calibri" w:hAnsi="Calibri" w:eastAsia="宋体"/>
         </w:rPr>
-        <w:t>Object Oriented Development with Java：用 Java 按面向对象方式拆模块。</w:t>
+        <w:t>Systems Analysis and Design：把业务流程拆成实体、字段和功能。</w:t>
       </w:r>
     </w:p>
     <w:p>
@@ -243,11 +217,24 @@
       </w:pPr>
       <w:r>
         <w:rPr>
-          <w:rFonts w:ascii="Calibri" w:hAnsi="Calibri" w:eastAsia="宋体"/>
           <w:b w:val="0"/>
           <w:sz w:val="21"/>
+          <w:rFonts w:ascii="Calibri" w:hAnsi="Calibri" w:eastAsia="宋体"/>
         </w:rPr>
-        <w:t>Probability and Statistical Modelling：描述统计、相关与回归。课程中使用过 R、Power BI。</w:t>
+        <w:t>计算机基础：Networking、Systems Software and Computing Concepts、Integrated Computer Systems、Mathematical Concepts for Computing、Introduction to Artificial Intelligence。</w:t>
+      </w:r>
+    </w:p>
+    <w:p>
+      <w:pPr>
+        <w:spacing w:after="40" w:before="60" w:line="252" w:lineRule="auto"/>
+      </w:pPr>
+      <w:r>
+        <w:rPr>
+          <w:b/>
+          <w:sz w:val="21"/>
+          <w:rFonts w:ascii="Calibri" w:hAnsi="Calibri" w:eastAsia="宋体"/>
+        </w:rPr>
+        <w:t>大二在修（没上过的删掉）</w:t>
       </w:r>
     </w:p>
     <w:p>
@@ -257,11 +244,11 @@
       </w:pPr>
       <w:r>
         <w:rPr>
-          <w:rFonts w:ascii="Calibri" w:hAnsi="Calibri" w:eastAsia="宋体"/>
           <w:b w:val="0"/>
           <w:sz w:val="21"/>
+          <w:rFonts w:ascii="Calibri" w:hAnsi="Calibri" w:eastAsia="宋体"/>
         </w:rPr>
-        <w:t>Data Structures、Data Management：数据结构与数据管理。</w:t>
+        <w:t>Object Oriented Development with Java：类、对象、按模块拆方法。</w:t>
       </w:r>
     </w:p>
     <w:p>
@@ -271,28 +258,11 @@
       </w:pPr>
       <w:r>
         <w:rPr>
-          <w:rFonts w:ascii="Calibri" w:hAnsi="Calibri" w:eastAsia="宋体"/>
           <w:b w:val="0"/>
           <w:sz w:val="21"/>
+          <w:rFonts w:ascii="Calibri" w:hAnsi="Calibri" w:eastAsia="宋体"/>
         </w:rPr>
-        <w:t>Data Mining and Predictive Modelling：数据挖掘与预测模型入门。</w:t>
-      </w:r>
-    </w:p>
-    <w:p>
-      <w:pPr>
-        <w:spacing w:after="60" w:before="160" w:line="259" w:lineRule="auto"/>
-        <w:pBdr>
-          <w:bottom w:val="single" w:sz="6" w:space="1" w:color="1F6F6A"/>
-        </w:pBdr>
-      </w:pPr>
-      <w:r>
-        <w:rPr>
-          <w:rFonts w:ascii="Calibri" w:hAnsi="Calibri" w:eastAsia="宋体"/>
-          <w:b/>
-          <w:color w:val="1F6F6A"/>
-          <w:sz w:val="24"/>
-        </w:rPr>
-        <w:t>目前能独立做的事</w:t>
+        <w:t>Probability and Statistical Modelling：均值、占比、相关与一元回归。课程里用过 R、Power BI。</w:t>
       </w:r>
     </w:p>
     <w:p>
@@ -302,11 +272,11 @@
       </w:pPr>
       <w:r>
         <w:rPr>
-          <w:rFonts w:ascii="Calibri" w:hAnsi="Calibri" w:eastAsia="宋体"/>
           <w:b w:val="0"/>
           <w:sz w:val="21"/>
+          <w:rFonts w:ascii="Calibri" w:hAnsi="Calibri" w:eastAsia="宋体"/>
         </w:rPr>
-        <w:t>用 SQL 把订单、类目、渠道连起来，算出营业额、客单价、退货率和转化率。</w:t>
+        <w:t>Data Structures、Data Management：基本数据结构，以及数据整理和查询。</w:t>
       </w:r>
     </w:p>
     <w:p>
@@ -316,11 +286,28 @@
       </w:pPr>
       <w:r>
         <w:rPr>
-          <w:rFonts w:ascii="Calibri" w:hAnsi="Calibri" w:eastAsia="宋体"/>
           <w:b w:val="0"/>
           <w:sz w:val="21"/>
+          <w:rFonts w:ascii="Calibri" w:hAnsi="Calibri" w:eastAsia="宋体"/>
         </w:rPr>
-        <w:t>把这些指标做成可以筛选的网页，并写成运营能看懂的结论。</w:t>
+        <w:t>Data Mining and Predictive Modelling：入门概念。没做完的模型不要写成会上线。</w:t>
+      </w:r>
+    </w:p>
+    <w:p>
+      <w:pPr>
+        <w:spacing w:after="40" w:before="140" w:line="252" w:lineRule="auto"/>
+        <w:pBdr>
+          <w:bottom w:val="single" w:sz="6" w:space="1" w:color="1F6F6A"/>
+        </w:pBdr>
+      </w:pPr>
+      <w:r>
+        <w:rPr>
+          <w:b/>
+          <w:color w:val="1F6F6A"/>
+          <w:sz w:val="24"/>
+          <w:rFonts w:ascii="Calibri" w:hAnsi="Calibri" w:eastAsia="宋体"/>
+        </w:rPr>
+        <w:t>取数和呈现（面试可以当场写）</w:t>
       </w:r>
     </w:p>
     <w:p>
@@ -330,54 +317,11 @@
       </w:pPr>
       <w:r>
         <w:rPr>
-          <w:rFonts w:ascii="Calibri" w:hAnsi="Calibri" w:eastAsia="宋体"/>
           <w:b w:val="0"/>
           <w:sz w:val="21"/>
+          <w:rFonts w:ascii="Calibri" w:hAnsi="Calibri" w:eastAsia="宋体"/>
         </w:rPr>
-        <w:t>用 Python、C、Java 完成课程里的程序，而不只是会打开软件。</w:t>
-      </w:r>
-    </w:p>
-    <w:p>
-      <w:pPr>
-        <w:spacing w:after="60" w:before="160" w:line="259" w:lineRule="auto"/>
-        <w:pBdr>
-          <w:bottom w:val="single" w:sz="6" w:space="1" w:color="1F6F6A"/>
-        </w:pBdr>
-      </w:pPr>
-      <w:r>
-        <w:rPr>
-          <w:rFonts w:ascii="Calibri" w:hAnsi="Calibri" w:eastAsia="宋体"/>
-          <w:b/>
-          <w:color w:val="1F6F6A"/>
-          <w:sz w:val="24"/>
-        </w:rPr>
-        <w:t>项目经历</w:t>
-      </w:r>
-    </w:p>
-    <w:p>
-      <w:pPr>
-        <w:spacing w:after="40" w:before="0" w:line="259" w:lineRule="auto"/>
-      </w:pPr>
-      <w:r>
-        <w:rPr>
-          <w:rFonts w:ascii="Calibri" w:hAnsi="Calibri" w:eastAsia="宋体"/>
-          <w:b/>
-          <w:sz w:val="21"/>
-        </w:rPr>
-        <w:t>营析 · 网店经营分析页面</w:t>
-      </w:r>
-    </w:p>
-    <w:p>
-      <w:pPr>
-        <w:spacing w:after="40" w:before="0" w:line="259" w:lineRule="auto"/>
-      </w:pPr>
-      <w:r>
-        <w:rPr>
-          <w:rFonts w:ascii="Calibri" w:hAnsi="Calibri" w:eastAsia="宋体"/>
-          <w:b w:val="0"/>
-          <w:sz w:val="21"/>
-        </w:rPr>
-        <w:t>自己做的分析网页，用来回答：这家店最近赚了多少、货退在哪、客人在哪一步离开、钱是新客还是老客带来的。数据是按固定规则生成的 90 天练习订单，不是某家公司的真实后台。页面可以打开看，指标也可以用 SQL 写出来。</w:t>
+        <w:t>SQL：SUM / COUNT 算营业额和订单；金额除以订单数算客单价；退货额除以营业额算退货率，用 NULLIF 避免除以 0；WHERE 限制日期、类目、渠道；GROUP BY 按类目比较。</w:t>
       </w:r>
     </w:p>
     <w:p>
@@ -387,11 +331,11 @@
       </w:pPr>
       <w:r>
         <w:rPr>
-          <w:rFonts w:ascii="Calibri" w:hAnsi="Calibri" w:eastAsia="宋体"/>
           <w:b w:val="0"/>
           <w:sz w:val="21"/>
+          <w:rFonts w:ascii="Calibri" w:hAnsi="Calibri" w:eastAsia="宋体"/>
         </w:rPr>
-        <w:t>近 90 天：营业额 ¥525,328，订单 6,401，平均每单 ¥82，退货金额占 8.2%，大约每 100 次浏览有 14 次付款。</w:t>
+        <w:t>漏斗：浏览到加购、加购到下单、下单到支付，能指出流失最大的一步。</w:t>
       </w:r>
     </w:p>
     <w:p>
@@ -401,11 +345,54 @@
       </w:pPr>
       <w:r>
         <w:rPr>
-          <w:rFonts w:ascii="Calibri" w:hAnsi="Calibri" w:eastAsia="宋体"/>
           <w:b w:val="0"/>
           <w:sz w:val="21"/>
+          <w:rFonts w:ascii="Calibri" w:hAnsi="Calibri" w:eastAsia="宋体"/>
         </w:rPr>
-        <w:t>家居收纳退货约 18.8%，个护清洁约 4.3%。应先核对尺寸说明和质量，而不是继续投广告。</w:t>
+        <w:t>看板：近 7 / 30 / 90 天、类目、渠道筛选后，指标和结论一起变。页面为 Next.js、TypeScript，图表为 Recharts。</w:t>
+      </w:r>
+    </w:p>
+    <w:p>
+      <w:pPr>
+        <w:spacing w:after="40" w:before="140" w:line="252" w:lineRule="auto"/>
+        <w:pBdr>
+          <w:bottom w:val="single" w:sz="6" w:space="1" w:color="1F6F6A"/>
+        </w:pBdr>
+      </w:pPr>
+      <w:r>
+        <w:rPr>
+          <w:b/>
+          <w:color w:val="1F6F6A"/>
+          <w:sz w:val="24"/>
+          <w:rFonts w:ascii="Calibri" w:hAnsi="Calibri" w:eastAsia="宋体"/>
+        </w:rPr>
+        <w:t>项目经历</w:t>
+      </w:r>
+    </w:p>
+    <w:p>
+      <w:pPr>
+        <w:spacing w:after="40" w:before="0" w:line="252" w:lineRule="auto"/>
+      </w:pPr>
+      <w:r>
+        <w:rPr>
+          <w:b/>
+          <w:sz w:val="21"/>
+          <w:rFonts w:ascii="Calibri" w:hAnsi="Calibri" w:eastAsia="宋体"/>
+        </w:rPr>
+        <w:t>营析 · 网店经营分析台</w:t>
+      </w:r>
+    </w:p>
+    <w:p>
+      <w:pPr>
+        <w:spacing w:after="40" w:before="0" w:line="252" w:lineRule="auto"/>
+      </w:pPr>
+      <w:r>
+        <w:rPr>
+          <w:b w:val="0"/>
+          <w:sz w:val="21"/>
+          <w:rFonts w:ascii="Calibri" w:hAnsi="Calibri" w:eastAsia="宋体"/>
+        </w:rPr>
+        <w:t>独立完成并可在线打开的经营分析页：这段时间卖了多少、哪一类在退货、客人在哪一步离开、新客和老客谁贡献营业额。订单是固定规则生成的 90 天练习数据，不是真实公司后台。口径和等价 SQL 在项目「方法」页。</w:t>
       </w:r>
     </w:p>
     <w:p>
@@ -415,11 +402,11 @@
       </w:pPr>
       <w:r>
         <w:rPr>
-          <w:rFonts w:ascii="Calibri" w:hAnsi="Calibri" w:eastAsia="宋体"/>
           <w:b w:val="0"/>
           <w:sz w:val="21"/>
+          <w:rFonts w:ascii="Calibri" w:hAnsi="Calibri" w:eastAsia="宋体"/>
         </w:rPr>
-        <w:t>加购之后只有约 35% 会下单。信息流广告大约 8.5% 的浏览会付款，老客户回访大约 30.5%。预算应先给已经验证过的渠道。</w:t>
+        <w:t>近 90 天：营业额 ¥525,328，订单 6,401，客单价 ¥82，退货率 8.2%，浏览到支付 14.4%。</w:t>
       </w:r>
     </w:p>
     <w:p>
@@ -429,29 +416,57 @@
       </w:pPr>
       <w:r>
         <w:rPr>
-          <w:rFonts w:ascii="Calibri" w:hAnsi="Calibri" w:eastAsia="宋体"/>
           <w:b w:val="0"/>
           <w:sz w:val="21"/>
+          <w:rFonts w:ascii="Calibri" w:hAnsi="Calibri" w:eastAsia="宋体"/>
         </w:rPr>
-        <w:t>老客户贡献约 57% 的营业额。可以留一部分预算做复购，而不是只发新客券。</w:t>
+        <w:t>家居收纳退货率 18.8%，个护清洁 4.3%。建议先改详情页尺寸说明和质检。</w:t>
       </w:r>
     </w:p>
     <w:p>
       <w:pPr>
-        <w:spacing w:after="40" w:before="0" w:line="259" w:lineRule="auto"/>
+        <w:pStyle w:val="ListBullet"/>
+        <w:spacing w:after="20" w:line="252" w:lineRule="auto"/>
       </w:pPr>
       <w:r>
         <w:rPr>
-          <w:rFonts w:ascii="Calibri" w:hAnsi="Calibri" w:eastAsia="宋体"/>
           <w:b w:val="0"/>
           <w:sz w:val="21"/>
+          <w:rFonts w:ascii="Calibri" w:hAnsi="Calibri" w:eastAsia="宋体"/>
+        </w:rPr>
+        <w:t>加购到下单 35.1%，是最大流失。信息流浏览到支付 8.5%，老客回访 30.5%。建议把预算给已经验证的渠道。</w:t>
+      </w:r>
+    </w:p>
+    <w:p>
+      <w:pPr>
+        <w:pStyle w:val="ListBullet"/>
+        <w:spacing w:after="20" w:line="252" w:lineRule="auto"/>
+      </w:pPr>
+      <w:r>
+        <w:rPr>
+          <w:b w:val="0"/>
+          <w:sz w:val="21"/>
+          <w:rFonts w:ascii="Calibri" w:hAnsi="Calibri" w:eastAsia="宋体"/>
+        </w:rPr>
+        <w:t>老客贡献 57.2% 营业额，复购用户占付款用户 59.2%。建议把一部分拉新券改成复购券。</w:t>
+      </w:r>
+    </w:p>
+    <w:p>
+      <w:pPr>
+        <w:spacing w:after="40" w:before="0" w:line="252" w:lineRule="auto"/>
+      </w:pPr>
+      <w:r>
+        <w:rPr>
+          <w:b w:val="0"/>
+          <w:sz w:val="21"/>
+          <w:rFonts w:ascii="Calibri" w:hAnsi="Calibri" w:eastAsia="宋体"/>
         </w:rPr>
         <w:t>在线演示：https://yingxi-analytics.vercel.app</w:t>
       </w:r>
     </w:p>
     <w:sectPr>
       <w:pgSz w:w="12240" w:h="15840"/>
-      <w:pgMar w:top="737" w:right="907" w:bottom="737" w:left="907" w:header="720" w:footer="720" w:gutter="0"/>
+      <w:pgMar w:top="709" w:right="879" w:bottom="709" w:left="879" w:header="720" w:footer="720" w:gutter="0"/>
       <w:cols w:space="720"/>
       <w:docGrid w:linePitch="360"/>
     </w:sectPr>

</xml_diff>

<commit_message>
Expand the resume with the real table, SQL, and page structure of Yingxi.
Keep every line tied to the deployed demo and coursework so it can be explained in an interview.

Co-authored-by: entice0328 <entice0328@gmail.com>
</commit_message>
<xml_diff>
--- a/resume/张力元-数据分析实习生.docx
+++ b/resume/张力元-数据分析实习生.docx
@@ -57,7 +57,7 @@
     </w:p>
     <w:p>
       <w:pPr>
-        <w:spacing w:after="60" w:before="0" w:line="252" w:lineRule="auto"/>
+        <w:spacing w:after="40" w:before="0" w:line="252" w:lineRule="auto"/>
       </w:pPr>
       <w:r>
         <w:rPr>
@@ -70,7 +70,7 @@
     </w:p>
     <w:p>
       <w:pPr>
-        <w:spacing w:after="40" w:before="140" w:line="252" w:lineRule="auto"/>
+        <w:spacing w:after="40" w:before="120" w:line="252" w:lineRule="auto"/>
         <w:pBdr>
           <w:bottom w:val="single" w:sz="6" w:space="1" w:color="1F6F6A"/>
         </w:pBdr>
@@ -95,12 +95,12 @@
           <w:sz w:val="21"/>
           <w:rFonts w:ascii="Calibri" w:hAnsi="Calibri" w:eastAsia="宋体"/>
         </w:rPr>
-        <w:t>数据分析实习生、数据运营、商业分析、BI。计划 2026 年 1 月到武汉实习，10 月起可沟通，12 月可面试。可做取数、指标口径、经营看板和周报复盘。</w:t>
+        <w:t>数据分析实习生、数据运营、商业分析、BI。计划 2026 年 1 月到武汉实习，10 月起可沟通，12 月可面试。到岗后可以按口径写 SQL、对看板数字、整理周报结论。</w:t>
       </w:r>
     </w:p>
     <w:p>
       <w:pPr>
-        <w:spacing w:after="40" w:before="140" w:line="252" w:lineRule="auto"/>
+        <w:spacing w:after="40" w:before="120" w:line="252" w:lineRule="auto"/>
         <w:pBdr>
           <w:bottom w:val="single" w:sz="6" w:space="1" w:color="1F6F6A"/>
         </w:pBdr>
@@ -143,7 +143,7 @@
     </w:p>
     <w:p>
       <w:pPr>
-        <w:spacing w:after="40" w:before="60" w:line="252" w:lineRule="auto"/>
+        <w:spacing w:after="40" w:before="40" w:line="252" w:lineRule="auto"/>
       </w:pPr>
       <w:r>
         <w:rPr>
@@ -165,7 +165,7 @@
           <w:sz w:val="21"/>
           <w:rFonts w:ascii="Calibri" w:hAnsi="Calibri" w:eastAsia="宋体"/>
         </w:rPr>
-        <w:t>Python Programming：变量、函数、条件、循环、list / dict，用字典做分组计数，读写简单文本。</w:t>
+        <w:t>Python Programming：变量、函数、条件、循环；list 与 dict；用字典按类别计数；读写简单文本。</w:t>
       </w:r>
     </w:p>
     <w:p>
@@ -179,7 +179,7 @@
           <w:sz w:val="21"/>
           <w:rFonts w:ascii="Calibri" w:hAnsi="Calibri" w:eastAsia="宋体"/>
         </w:rPr>
-        <w:t>Introduction to C Programming：基本语法、分支、循环和函数。</w:t>
+        <w:t>Introduction to C Programming：变量、分支、循环、函数。</w:t>
       </w:r>
     </w:p>
     <w:p>
@@ -193,7 +193,7 @@
           <w:sz w:val="21"/>
           <w:rFonts w:ascii="Calibri" w:hAnsi="Calibri" w:eastAsia="宋体"/>
         </w:rPr>
-        <w:t>Introduction to Databases：建表、主键与表关系；SQL 的 WHERE、排序和聚合。</w:t>
+        <w:t>Introduction to Databases：表、主键、表关系；SQL 的 WHERE、AND/OR、ORDER BY、COUNT、SUM。</w:t>
       </w:r>
     </w:p>
     <w:p>
@@ -207,7 +207,7 @@
           <w:sz w:val="21"/>
           <w:rFonts w:ascii="Calibri" w:hAnsi="Calibri" w:eastAsia="宋体"/>
         </w:rPr>
-        <w:t>Systems Analysis and Design：把业务流程拆成实体、字段和功能。</w:t>
+        <w:t>Systems Analysis and Design：先画业务流程，再定实体和字段。</w:t>
       </w:r>
     </w:p>
     <w:p>
@@ -226,7 +226,7 @@
     </w:p>
     <w:p>
       <w:pPr>
-        <w:spacing w:after="40" w:before="60" w:line="252" w:lineRule="auto"/>
+        <w:spacing w:after="40" w:before="40" w:line="252" w:lineRule="auto"/>
       </w:pPr>
       <w:r>
         <w:rPr>
@@ -234,7 +234,7 @@
           <w:sz w:val="21"/>
           <w:rFonts w:ascii="Calibri" w:hAnsi="Calibri" w:eastAsia="宋体"/>
         </w:rPr>
-        <w:t>大二在修（没上过的删掉）</w:t>
+        <w:t>大二在修（没上过的整行删掉）</w:t>
       </w:r>
     </w:p>
     <w:p>
@@ -248,7 +248,7 @@
           <w:sz w:val="21"/>
           <w:rFonts w:ascii="Calibri" w:hAnsi="Calibri" w:eastAsia="宋体"/>
         </w:rPr>
-        <w:t>Object Oriented Development with Java：类、对象、按模块拆方法。</w:t>
+        <w:t>Object Oriented Development with Java：类、对象、方法，把小系统拆成几块。</w:t>
       </w:r>
     </w:p>
     <w:p>
@@ -262,7 +262,7 @@
           <w:sz w:val="21"/>
           <w:rFonts w:ascii="Calibri" w:hAnsi="Calibri" w:eastAsia="宋体"/>
         </w:rPr>
-        <w:t>Probability and Statistical Modelling：均值、占比、相关与一元回归。课程里用过 R、Power BI。</w:t>
+        <w:t>Probability and Statistical Modelling：均值、占比、相关、一元回归。课堂用过 R 和 Power BI。</w:t>
       </w:r>
     </w:p>
     <w:p>
@@ -276,7 +276,7 @@
           <w:sz w:val="21"/>
           <w:rFonts w:ascii="Calibri" w:hAnsi="Calibri" w:eastAsia="宋体"/>
         </w:rPr>
-        <w:t>Data Structures、Data Management：基本数据结构，以及数据整理和查询。</w:t>
+        <w:t>Data Structures、Data Management：数组和链表这一级的结构；多条件查询和数据整理。</w:t>
       </w:r>
     </w:p>
     <w:p>
@@ -290,12 +290,12 @@
           <w:sz w:val="21"/>
           <w:rFonts w:ascii="Calibri" w:hAnsi="Calibri" w:eastAsia="宋体"/>
         </w:rPr>
-        <w:t>Data Mining and Predictive Modelling：入门概念。没做完的模型不要写成会上线。</w:t>
+        <w:t>Data Mining and Predictive Modelling：知道分类、聚类、预测模型指什么。不写成会部署模型。</w:t>
       </w:r>
     </w:p>
     <w:p>
       <w:pPr>
-        <w:spacing w:after="40" w:before="140" w:line="252" w:lineRule="auto"/>
+        <w:spacing w:after="40" w:before="120" w:line="252" w:lineRule="auto"/>
         <w:pBdr>
           <w:bottom w:val="single" w:sz="6" w:space="1" w:color="1F6F6A"/>
         </w:pBdr>
@@ -307,7 +307,7 @@
           <w:sz w:val="24"/>
           <w:rFonts w:ascii="Calibri" w:hAnsi="Calibri" w:eastAsia="宋体"/>
         </w:rPr>
-        <w:t>取数和呈现（面试可以当场写）</w:t>
+        <w:t>取数时会写的 SQL</w:t>
       </w:r>
     </w:p>
     <w:p>
@@ -321,7 +321,7 @@
           <w:sz w:val="21"/>
           <w:rFonts w:ascii="Calibri" w:hAnsi="Calibri" w:eastAsia="宋体"/>
         </w:rPr>
-        <w:t>SQL：SUM / COUNT 算营业额和订单；金额除以订单数算客单价；退货额除以营业额算退货率，用 NULLIF 避免除以 0；WHERE 限制日期、类目、渠道；GROUP BY 按类目比较。</w:t>
+        <w:t>营业额用 SUM(gmv)，订单用 COUNT(*)，两者相除是客单价；退货率是 SUM(refund)/SUM(gmv)，分母用 NULLIF 避免除零。</w:t>
       </w:r>
     </w:p>
     <w:p>
@@ -335,7 +335,7 @@
           <w:sz w:val="21"/>
           <w:rFonts w:ascii="Calibri" w:hAnsi="Calibri" w:eastAsia="宋体"/>
         </w:rPr>
-        <w:t>漏斗：浏览到加购、加购到下单、下单到支付，能指出流失最大的一步。</w:t>
+        <w:t>WHERE 限制日期，再加类目和渠道；选全部时不额外限制该字段。</w:t>
       </w:r>
     </w:p>
     <w:p>
@@ -349,12 +349,40 @@
           <w:sz w:val="21"/>
           <w:rFonts w:ascii="Calibri" w:hAnsi="Calibri" w:eastAsia="宋体"/>
         </w:rPr>
-        <w:t>看板：近 7 / 30 / 90 天、类目、渠道筛选后，指标和结论一起变。页面为 Next.js、TypeScript，图表为 Recharts。</w:t>
+        <w:t>GROUP BY category，按营业额排序，并带上该类目退货率。</w:t>
       </w:r>
     </w:p>
     <w:p>
       <w:pPr>
-        <w:spacing w:after="40" w:before="140" w:line="252" w:lineRule="auto"/>
+        <w:pStyle w:val="ListBullet"/>
+        <w:spacing w:after="20" w:line="252" w:lineRule="auto"/>
+      </w:pPr>
+      <w:r>
+        <w:rPr>
+          <w:b w:val="0"/>
+          <w:sz w:val="21"/>
+          <w:rFonts w:ascii="Calibri" w:hAnsi="Calibri" w:eastAsia="宋体"/>
+        </w:rPr>
+        <w:t>漏斗对浏览、加购、下单、支付分别求和，再算相邻两步的比率。</w:t>
+      </w:r>
+    </w:p>
+    <w:p>
+      <w:pPr>
+        <w:pStyle w:val="ListBullet"/>
+        <w:spacing w:after="20" w:line="252" w:lineRule="auto"/>
+      </w:pPr>
+      <w:r>
+        <w:rPr>
+          <w:b w:val="0"/>
+          <w:sz w:val="21"/>
+          <w:rFonts w:ascii="Calibri" w:hAnsi="Calibri" w:eastAsia="宋体"/>
+        </w:rPr>
+        <w:t>按是否新客汇总营业额，看新客和老客各占多少。</w:t>
+      </w:r>
+    </w:p>
+    <w:p>
+      <w:pPr>
+        <w:spacing w:after="40" w:before="120" w:line="252" w:lineRule="auto"/>
         <w:pBdr>
           <w:bottom w:val="single" w:sz="6" w:space="1" w:color="1F6F6A"/>
         </w:pBdr>
@@ -392,7 +420,33 @@
           <w:sz w:val="21"/>
           <w:rFonts w:ascii="Calibri" w:hAnsi="Calibri" w:eastAsia="宋体"/>
         </w:rPr>
-        <w:t>独立完成并可在线打开的经营分析页：这段时间卖了多少、哪一类在退货、客人在哪一步离开、新客和老客谁贡献营业额。订单是固定规则生成的 90 天练习数据，不是真实公司后台。口径和等价 SQL 在项目「方法」页。</w:t>
+        <w:t>独立完成并已上线。回答：卖了多少、哪一类在退货、客人在哪一步离开、钱来自新客还是老客。数据是固定规则生成的 90 天练习订单，不是真实公司后台。规则里故意让家居退货更高、信息流转化更低，所以结论是算出来的。</w:t>
+      </w:r>
+    </w:p>
+    <w:p>
+      <w:pPr>
+        <w:spacing w:after="40" w:before="0" w:line="252" w:lineRule="auto"/>
+      </w:pPr>
+      <w:r>
+        <w:rPr>
+          <w:b w:val="0"/>
+          <w:sz w:val="21"/>
+          <w:rFonts w:ascii="Calibri" w:hAnsi="Calibri" w:eastAsia="宋体"/>
+        </w:rPr>
+        <w:t>订单字段：日期、五个类目、四个渠道、商品、金额、退货金额、是否新客。流量字段：同一天、同一类目、同一渠道下的浏览、加购、下单、支付。</w:t>
+      </w:r>
+    </w:p>
+    <w:p>
+      <w:pPr>
+        <w:spacing w:after="40" w:before="0" w:line="252" w:lineRule="auto"/>
+      </w:pPr>
+      <w:r>
+        <w:rPr>
+          <w:b w:val="0"/>
+          <w:sz w:val="21"/>
+          <w:rFonts w:ascii="Calibri" w:hAnsi="Calibri" w:eastAsia="宋体"/>
+        </w:rPr>
+        <w:t>页面：经营概览（四个指标、环比、折线、类目表）、转化漏斗、客户结构、三条会随筛选重算的结论、指标定义和 SQL。筛选有近 7 / 30 / 90 天、类目、渠道。技术：Next.js、TypeScript、Recharts。</w:t>
       </w:r>
     </w:p>
     <w:p>
@@ -420,7 +474,7 @@
           <w:sz w:val="21"/>
           <w:rFonts w:ascii="Calibri" w:hAnsi="Calibri" w:eastAsia="宋体"/>
         </w:rPr>
-        <w:t>家居收纳退货率 18.8%，个护清洁 4.3%。建议先改详情页尺寸说明和质检。</w:t>
+        <w:t>家居收纳退货率 18.8%，个护清洁 4.3%。建议先改尺寸说明和质检。</w:t>
       </w:r>
     </w:p>
     <w:p>
@@ -434,7 +488,7 @@
           <w:sz w:val="21"/>
           <w:rFonts w:ascii="Calibri" w:hAnsi="Calibri" w:eastAsia="宋体"/>
         </w:rPr>
-        <w:t>加购到下单 35.1%，是最大流失。信息流浏览到支付 8.5%，老客回访 30.5%。建议把预算给已经验证的渠道。</w:t>
+        <w:t>加购到下单 35.1%，流失最大。信息流浏览到支付 8.5%，老客复访 30.5%。</w:t>
       </w:r>
     </w:p>
     <w:p>
@@ -448,7 +502,7 @@
           <w:sz w:val="21"/>
           <w:rFonts w:ascii="Calibri" w:hAnsi="Calibri" w:eastAsia="宋体"/>
         </w:rPr>
-        <w:t>老客贡献 57.2% 营业额，复购用户占付款用户 59.2%。建议把一部分拉新券改成复购券。</w:t>
+        <w:t>老客贡献 57.2% 营业额，复购用户占付款用户 59.2%。</w:t>
       </w:r>
     </w:p>
     <w:p>
@@ -466,7 +520,7 @@
     </w:p>
     <w:sectPr>
       <w:pgSz w:w="12240" w:h="15840"/>
-      <w:pgMar w:top="709" w:right="879" w:bottom="709" w:left="879" w:header="720" w:footer="720" w:gutter="0"/>
+      <w:pgMar w:top="680" w:right="850" w:bottom="680" w:left="850" w:header="720" w:footer="720" w:gutter="0"/>
       <w:cols w:space="720"/>
       <w:docGrid w:linePitch="360"/>
     </w:sectPr>

</xml_diff>

<commit_message>
Add the Power BI workshop line to the Word resume.
Co-authored-by: entice0328 <entice0328@gmail.com>
</commit_message>
<xml_diff>
--- a/resume/张力元-数据分析实习生.docx
+++ b/resume/张力元-数据分析实习生.docx
@@ -262,7 +262,7 @@
           <w:sz w:val="21"/>
           <w:rFonts w:ascii="Calibri" w:hAnsi="Calibri" w:eastAsia="宋体"/>
         </w:rPr>
-        <w:t>Probability and Statistical Modelling：均值、占比、相关、一元回归。课堂用过 R 和 Power BI。</w:t>
+        <w:t>Probability and Statistical Modelling：均值、占比、相关、一元回归。课堂用 R 做过描述统计。</w:t>
       </w:r>
     </w:p>
     <w:p>
@@ -276,7 +276,21 @@
           <w:sz w:val="21"/>
           <w:rFonts w:ascii="Calibri" w:hAnsi="Calibri" w:eastAsia="宋体"/>
         </w:rPr>
-        <w:t>Data Structures、Data Management：数组和链表这一级的结构；多条件查询和数据整理。</w:t>
+        <w:t>Data Structures：数组、链表这一级的基本结构。</w:t>
+      </w:r>
+    </w:p>
+    <w:p>
+      <w:pPr>
+        <w:pStyle w:val="ListBullet"/>
+        <w:spacing w:after="20" w:line="252" w:lineRule="auto"/>
+      </w:pPr>
+      <w:r>
+        <w:rPr>
+          <w:b w:val="0"/>
+          <w:sz w:val="21"/>
+          <w:rFonts w:ascii="Calibri" w:hAnsi="Calibri" w:eastAsia="宋体"/>
+        </w:rPr>
+        <w:t>Data Management：在数据库导论之后，继续做数据整理和多条件查询。</w:t>
       </w:r>
     </w:p>
     <w:p>
@@ -291,6 +305,37 @@
           <w:rFonts w:ascii="Calibri" w:hAnsi="Calibri" w:eastAsia="宋体"/>
         </w:rPr>
         <w:t>Data Mining and Predictive Modelling：知道分类、聚类、预测模型指什么。不写成会部署模型。</w:t>
+      </w:r>
+    </w:p>
+    <w:p>
+      <w:pPr>
+        <w:spacing w:after="40" w:before="120" w:line="252" w:lineRule="auto"/>
+        <w:pBdr>
+          <w:bottom w:val="single" w:sz="6" w:space="1" w:color="1F6F6A"/>
+        </w:pBdr>
+      </w:pPr>
+      <w:r>
+        <w:rPr>
+          <w:b/>
+          <w:color w:val="1F6F6A"/>
+          <w:sz w:val="24"/>
+          <w:rFonts w:ascii="Calibri" w:hAnsi="Calibri" w:eastAsia="宋体"/>
+        </w:rPr>
+        <w:t>工作坊</w:t>
+      </w:r>
+    </w:p>
+    <w:p>
+      <w:pPr>
+        <w:pStyle w:val="ListBullet"/>
+        <w:spacing w:after="20" w:line="252" w:lineRule="auto"/>
+      </w:pPr>
+      <w:r>
+        <w:rPr>
+          <w:b w:val="0"/>
+          <w:sz w:val="21"/>
+          <w:rFonts w:ascii="Calibri" w:hAnsi="Calibri" w:eastAsia="宋体"/>
+        </w:rPr>
+        <w:t>2026 年 8 月 18 日参加 APAC 的 Introduction to Power BI Workshop，获参与证书。内容是把表导入 Power BI、做基础图表。这是社团工作坊的参与证明，不是微软 Power BI（PL-300）认证。</w:t>
       </w:r>
     </w:p>
     <w:p>
@@ -420,7 +465,7 @@
           <w:sz w:val="21"/>
           <w:rFonts w:ascii="Calibri" w:hAnsi="Calibri" w:eastAsia="宋体"/>
         </w:rPr>
-        <w:t>独立完成并已上线。回答：卖了多少、哪一类在退货、客人在哪一步离开、钱来自新客还是老客。数据是固定规则生成的 90 天练习订单，不是真实公司后台。规则里故意让家居退货更高、信息流转化更低，所以结论是算出来的。</w:t>
+        <w:t>独立完成并已上线。回答：卖了多少、哪一类在退货、客人在哪一步离开、钱来自新客还是老客。数据是固定规则生成的 90 天练习订单，不是真实公司后台。规则里故意让家居退货更高、信息流转化更低。</w:t>
       </w:r>
     </w:p>
     <w:p>
@@ -446,7 +491,7 @@
           <w:sz w:val="21"/>
           <w:rFonts w:ascii="Calibri" w:hAnsi="Calibri" w:eastAsia="宋体"/>
         </w:rPr>
-        <w:t>页面：经营概览（四个指标、环比、折线、类目表）、转化漏斗、客户结构、三条会随筛选重算的结论、指标定义和 SQL。筛选有近 7 / 30 / 90 天、类目、渠道。技术：Next.js、TypeScript、Recharts。</w:t>
+        <w:t>页面：经营概览、转化漏斗、客户结构、三条会随筛选重算的结论、指标定义和 SQL。筛选有近 7 / 30 / 90 天、类目、渠道。技术：Next.js、TypeScript、Recharts。</w:t>
       </w:r>
     </w:p>
     <w:p>
@@ -520,7 +565,7 @@
     </w:p>
     <w:sectPr>
       <w:pgSz w:w="12240" w:h="15840"/>
-      <w:pgMar w:top="680" w:right="850" w:bottom="680" w:left="850" w:header="720" w:footer="720" w:gutter="0"/>
+      <w:pgMar w:top="652" w:right="850" w:bottom="652" w:left="850" w:header="720" w:footer="720" w:gutter="0"/>
       <w:cols w:space="720"/>
       <w:docGrid w:linePitch="360"/>
     </w:sectPr>

</xml_diff>